<commit_message>
Dodao 5.10 ssu i modifikovao 5.3 da se poklapa sa prototipom
TODO:
5.5 SSU Izmeniti da bude kao prototip
5.9 U prototip dodaj DELETE dugme
5.10 napravi kompletno u prototipu
Prebaci sve na srpski
Prepravi stamparske greske
</commit_message>
<xml_diff>
--- a/SSU/5.3 SSU.docx
+++ b/SSU/5.3 SSU.docx
@@ -6,16 +6,50 @@
       <w:pPr>
         <w:jc w:val="center"/>
       </w:pPr>
-      <w:r>
-        <w:t>Elektrotehnički fakultet u Beogradu</w:t>
-      </w:r>
+      <w:proofErr w:type="spellStart"/>
+      <w:r>
+        <w:t>Elektrotehnički</w:t>
+      </w:r>
+      <w:proofErr w:type="spellEnd"/>
+      <w:r>
+        <w:t xml:space="preserve"> </w:t>
+      </w:r>
+      <w:proofErr w:type="spellStart"/>
+      <w:r>
+        <w:t>fakultet</w:t>
+      </w:r>
+      <w:proofErr w:type="spellEnd"/>
+      <w:r>
+        <w:t xml:space="preserve"> u </w:t>
+      </w:r>
+      <w:proofErr w:type="spellStart"/>
+      <w:r>
+        <w:t>Beogradu</w:t>
+      </w:r>
+      <w:proofErr w:type="spellEnd"/>
     </w:p>
     <w:p>
       <w:pPr>
         <w:jc w:val="center"/>
       </w:pPr>
       <w:r>
-        <w:t>Principi Softverskog Inženjerstva (SI3PSI)</w:t>
+        <w:t xml:space="preserve">Principi </w:t>
+      </w:r>
+      <w:proofErr w:type="spellStart"/>
+      <w:r>
+        <w:t>Softverskog</w:t>
+      </w:r>
+      <w:proofErr w:type="spellEnd"/>
+      <w:r>
+        <w:t xml:space="preserve"> </w:t>
+      </w:r>
+      <w:proofErr w:type="spellStart"/>
+      <w:r>
+        <w:t>Inženjerstva</w:t>
+      </w:r>
+      <w:proofErr w:type="spellEnd"/>
+      <w:r>
+        <w:t xml:space="preserve"> (SI3PSI)</w:t>
       </w:r>
     </w:p>
     <w:p/>
@@ -49,9 +83,51 @@
         </w:rPr>
         <w:br/>
       </w:r>
-      <w:r>
-        <w:t>Specifikacija slučaja upotrebe funkcionalnosti pretrage komponenti</w:t>
-      </w:r>
+      <w:proofErr w:type="spellStart"/>
+      <w:r>
+        <w:t>Specifikacija</w:t>
+      </w:r>
+      <w:proofErr w:type="spellEnd"/>
+      <w:r>
+        <w:t xml:space="preserve"> </w:t>
+      </w:r>
+      <w:proofErr w:type="spellStart"/>
+      <w:r>
+        <w:t>slučaja</w:t>
+      </w:r>
+      <w:proofErr w:type="spellEnd"/>
+      <w:r>
+        <w:t xml:space="preserve"> </w:t>
+      </w:r>
+      <w:proofErr w:type="spellStart"/>
+      <w:r>
+        <w:t>upotrebe</w:t>
+      </w:r>
+      <w:proofErr w:type="spellEnd"/>
+      <w:r>
+        <w:t xml:space="preserve"> </w:t>
+      </w:r>
+      <w:proofErr w:type="spellStart"/>
+      <w:r>
+        <w:t>funkcionalnosti</w:t>
+      </w:r>
+      <w:proofErr w:type="spellEnd"/>
+      <w:r>
+        <w:t xml:space="preserve"> </w:t>
+      </w:r>
+      <w:proofErr w:type="spellStart"/>
+      <w:r>
+        <w:t>pretrage</w:t>
+      </w:r>
+      <w:proofErr w:type="spellEnd"/>
+      <w:r>
+        <w:t xml:space="preserve"> </w:t>
+      </w:r>
+      <w:proofErr w:type="spellStart"/>
+      <w:r>
+        <w:t>komponenti</w:t>
+      </w:r>
+      <w:proofErr w:type="spellEnd"/>
     </w:p>
     <w:p/>
     <w:p>
@@ -65,12 +141,21 @@
           <w:lang w:val="sr-Latn-RS"/>
         </w:rPr>
       </w:pPr>
-      <w:r>
-        <w:rPr>
-          <w:b/>
-          <w:bCs/>
-        </w:rPr>
-        <w:t>Verzija 1.0</w:t>
+      <w:proofErr w:type="spellStart"/>
+      <w:r>
+        <w:rPr>
+          <w:b/>
+          <w:bCs/>
+        </w:rPr>
+        <w:t>Verzija</w:t>
+      </w:r>
+      <w:proofErr w:type="spellEnd"/>
+      <w:r>
+        <w:rPr>
+          <w:b/>
+          <w:bCs/>
+        </w:rPr>
+        <w:t xml:space="preserve"> 1.0</w:t>
       </w:r>
     </w:p>
     <w:p>
@@ -656,6 +741,13 @@
     </w:p>
     <w:sdt>
       <w:sdtPr>
+        <w:rPr>
+          <w:rFonts w:ascii="Calibri" w:hAnsi="Calibri"/>
+          <w:color w:val="auto"/>
+          <w:kern w:val="2"/>
+          <w:sz w:val="24"/>
+          <w:szCs w:val="24"/>
+        </w:rPr>
         <w:id w:val="2045163926"/>
         <w:docPartObj>
           <w:docPartGallery w:val="Table of Contents"/>
@@ -664,14 +756,9 @@
       </w:sdtPr>
       <w:sdtEndPr>
         <w:rPr>
-          <w:rFonts w:ascii="Calibri" w:hAnsi="Calibri"/>
           <w:b/>
           <w:bCs/>
           <w:noProof/>
-          <w:color w:val="auto"/>
-          <w:kern w:val="2"/>
-          <w:sz w:val="24"/>
-          <w:szCs w:val="24"/>
         </w:rPr>
       </w:sdtEndPr>
       <w:sdtContent>
@@ -2125,10 +2212,20 @@
           <w:color w:val="auto"/>
         </w:rPr>
         <w:tab/>
+      </w:r>
+      <w:proofErr w:type="spellStart"/>
+      <w:r>
+        <w:rPr>
+          <w:rStyle w:val="Heading2Char"/>
+          <w:b/>
+          <w:bCs/>
+          <w:color w:val="auto"/>
+        </w:rPr>
         <w:t>Rezime</w:t>
       </w:r>
       <w:bookmarkEnd w:id="3"/>
       <w:bookmarkEnd w:id="4"/>
+      <w:proofErr w:type="spellEnd"/>
       <w:r>
         <w:rPr>
           <w:rStyle w:val="Heading2Char"/>
@@ -2171,10 +2268,100 @@
           <w:color w:val="auto"/>
         </w:rPr>
         <w:tab/>
-        <w:t>Namena dokumenta i ciljne grupe</w:t>
+      </w:r>
+      <w:proofErr w:type="spellStart"/>
+      <w:r>
+        <w:rPr>
+          <w:rStyle w:val="Heading2Char"/>
+          <w:b/>
+          <w:bCs/>
+          <w:color w:val="auto"/>
+        </w:rPr>
+        <w:t>Namena</w:t>
+      </w:r>
+      <w:proofErr w:type="spellEnd"/>
+      <w:r>
+        <w:rPr>
+          <w:rStyle w:val="Heading2Char"/>
+          <w:b/>
+          <w:bCs/>
+          <w:color w:val="auto"/>
+        </w:rPr>
+        <w:t xml:space="preserve"> </w:t>
+      </w:r>
+      <w:proofErr w:type="spellStart"/>
+      <w:r>
+        <w:rPr>
+          <w:rStyle w:val="Heading2Char"/>
+          <w:b/>
+          <w:bCs/>
+          <w:color w:val="auto"/>
+        </w:rPr>
+        <w:t>dokumenta</w:t>
+      </w:r>
+      <w:proofErr w:type="spellEnd"/>
+      <w:r>
+        <w:rPr>
+          <w:rStyle w:val="Heading2Char"/>
+          <w:b/>
+          <w:bCs/>
+          <w:color w:val="auto"/>
+        </w:rPr>
+        <w:t xml:space="preserve"> </w:t>
+      </w:r>
+      <w:proofErr w:type="spellStart"/>
+      <w:r>
+        <w:rPr>
+          <w:rStyle w:val="Heading2Char"/>
+          <w:b/>
+          <w:bCs/>
+          <w:color w:val="auto"/>
+        </w:rPr>
+        <w:t>i</w:t>
+      </w:r>
+      <w:proofErr w:type="spellEnd"/>
+      <w:r>
+        <w:rPr>
+          <w:rStyle w:val="Heading2Char"/>
+          <w:b/>
+          <w:bCs/>
+          <w:color w:val="auto"/>
+        </w:rPr>
+        <w:t xml:space="preserve"> </w:t>
+      </w:r>
+      <w:proofErr w:type="spellStart"/>
+      <w:r>
+        <w:rPr>
+          <w:rStyle w:val="Heading2Char"/>
+          <w:b/>
+          <w:bCs/>
+          <w:color w:val="auto"/>
+        </w:rPr>
+        <w:t>ciljne</w:t>
+      </w:r>
+      <w:proofErr w:type="spellEnd"/>
+      <w:r>
+        <w:rPr>
+          <w:rStyle w:val="Heading2Char"/>
+          <w:b/>
+          <w:bCs/>
+          <w:color w:val="auto"/>
+        </w:rPr>
+        <w:t xml:space="preserve"> </w:t>
+      </w:r>
+      <w:proofErr w:type="spellStart"/>
+      <w:r>
+        <w:rPr>
+          <w:rStyle w:val="Heading2Char"/>
+          <w:b/>
+          <w:bCs/>
+          <w:color w:val="auto"/>
+        </w:rPr>
+        <w:t>grupe</w:t>
       </w:r>
       <w:bookmarkEnd w:id="5"/>
       <w:bookmarkEnd w:id="6"/>
+      <w:proofErr w:type="spellEnd"/>
       <w:r>
         <w:rPr>
           <w:rStyle w:val="Heading2Char"/>
@@ -2309,10 +2496,37 @@
           <w:color w:val="auto"/>
         </w:rPr>
         <w:tab/>
-        <w:t>Otvorena pitanja</w:t>
+      </w:r>
+      <w:proofErr w:type="spellStart"/>
+      <w:r>
+        <w:rPr>
+          <w:b/>
+          <w:bCs/>
+          <w:color w:val="auto"/>
+        </w:rPr>
+        <w:t>Otvorena</w:t>
+      </w:r>
+      <w:proofErr w:type="spellEnd"/>
+      <w:r>
+        <w:rPr>
+          <w:b/>
+          <w:bCs/>
+          <w:color w:val="auto"/>
+        </w:rPr>
+        <w:t xml:space="preserve"> </w:t>
+      </w:r>
+      <w:proofErr w:type="spellStart"/>
+      <w:r>
+        <w:rPr>
+          <w:b/>
+          <w:bCs/>
+          <w:color w:val="auto"/>
+        </w:rPr>
+        <w:t>pitanja</w:t>
       </w:r>
       <w:bookmarkEnd w:id="9"/>
       <w:bookmarkEnd w:id="10"/>
+      <w:proofErr w:type="spellEnd"/>
     </w:p>
     <w:tbl>
       <w:tblPr>
@@ -2793,7 +3007,36 @@
           <w:color w:val="auto"/>
         </w:rPr>
         <w:tab/>
-        <w:t>Kratak opi</w:t>
+      </w:r>
+      <w:proofErr w:type="spellStart"/>
+      <w:r>
+        <w:rPr>
+          <w:rStyle w:val="Heading2Char"/>
+          <w:b/>
+          <w:bCs/>
+          <w:color w:val="auto"/>
+        </w:rPr>
+        <w:t>Kratak</w:t>
+      </w:r>
+      <w:proofErr w:type="spellEnd"/>
+      <w:r>
+        <w:rPr>
+          <w:rStyle w:val="Heading2Char"/>
+          <w:b/>
+          <w:bCs/>
+          <w:color w:val="auto"/>
+        </w:rPr>
+        <w:t xml:space="preserve"> </w:t>
+      </w:r>
+      <w:proofErr w:type="spellStart"/>
+      <w:r>
+        <w:rPr>
+          <w:rStyle w:val="Heading2Char"/>
+          <w:b/>
+          <w:bCs/>
+          <w:color w:val="auto"/>
+        </w:rPr>
+        <w:t>opi</w:t>
       </w:r>
       <w:bookmarkEnd w:id="13"/>
       <w:r>
@@ -2805,6 +3048,7 @@
         </w:rPr>
         <w:t>s</w:t>
       </w:r>
+      <w:proofErr w:type="spellEnd"/>
     </w:p>
     <w:p>
       <w:pPr>
@@ -2854,10 +3098,21 @@
           <w:color w:val="auto"/>
         </w:rPr>
         <w:tab/>
-        <w:t>Tok događaja</w:t>
+        <w:t xml:space="preserve">Tok </w:t>
+      </w:r>
+      <w:proofErr w:type="spellStart"/>
+      <w:r>
+        <w:rPr>
+          <w:rStyle w:val="Heading2Char"/>
+          <w:b/>
+          <w:bCs/>
+          <w:color w:val="auto"/>
+        </w:rPr>
+        <w:t>događaja</w:t>
       </w:r>
       <w:bookmarkEnd w:id="15"/>
       <w:bookmarkEnd w:id="16"/>
+      <w:proofErr w:type="spellEnd"/>
     </w:p>
     <w:p>
       <w:pPr>
@@ -2895,6 +3150,7 @@
         </w:rPr>
         <w:tab/>
       </w:r>
+      <w:proofErr w:type="spellStart"/>
       <w:r>
         <w:rPr>
           <w:rStyle w:val="Heading2Char"/>
@@ -2905,10 +3161,115 @@
           <w:szCs w:val="24"/>
           <w:u w:val="single"/>
         </w:rPr>
-        <w:t>Korisnik se odlučuje na tekstualnu pretragu</w:t>
+        <w:t>Korisnik</w:t>
+      </w:r>
+      <w:proofErr w:type="spellEnd"/>
+      <w:r>
+        <w:rPr>
+          <w:rStyle w:val="Heading2Char"/>
+          <w:b/>
+          <w:bCs/>
+          <w:color w:val="auto"/>
+          <w:sz w:val="24"/>
+          <w:szCs w:val="24"/>
+          <w:u w:val="single"/>
+        </w:rPr>
+        <w:t xml:space="preserve"> se </w:t>
+      </w:r>
+      <w:proofErr w:type="spellStart"/>
+      <w:r>
+        <w:rPr>
+          <w:rStyle w:val="Heading2Char"/>
+          <w:b/>
+          <w:bCs/>
+          <w:color w:val="auto"/>
+          <w:sz w:val="24"/>
+          <w:szCs w:val="24"/>
+          <w:u w:val="single"/>
+        </w:rPr>
+        <w:t>odlučuje</w:t>
+      </w:r>
+      <w:proofErr w:type="spellEnd"/>
+      <w:r>
+        <w:rPr>
+          <w:rStyle w:val="Heading2Char"/>
+          <w:b/>
+          <w:bCs/>
+          <w:color w:val="auto"/>
+          <w:sz w:val="24"/>
+          <w:szCs w:val="24"/>
+          <w:u w:val="single"/>
+        </w:rPr>
+        <w:t xml:space="preserve"> </w:t>
+      </w:r>
+      <w:proofErr w:type="spellStart"/>
+      <w:r>
+        <w:rPr>
+          <w:rStyle w:val="Heading2Char"/>
+          <w:b/>
+          <w:bCs/>
+          <w:color w:val="auto"/>
+          <w:sz w:val="24"/>
+          <w:szCs w:val="24"/>
+          <w:u w:val="single"/>
+        </w:rPr>
+        <w:t>na</w:t>
+      </w:r>
+      <w:proofErr w:type="spellEnd"/>
+      <w:r>
+        <w:rPr>
+          <w:rStyle w:val="Heading2Char"/>
+          <w:b/>
+          <w:bCs/>
+          <w:color w:val="auto"/>
+          <w:sz w:val="24"/>
+          <w:szCs w:val="24"/>
+          <w:u w:val="single"/>
+        </w:rPr>
+        <w:t xml:space="preserve"> </w:t>
+      </w:r>
+      <w:proofErr w:type="spellStart"/>
+      <w:r>
+        <w:rPr>
+          <w:rStyle w:val="Heading2Char"/>
+          <w:b/>
+          <w:bCs/>
+          <w:color w:val="auto"/>
+          <w:sz w:val="24"/>
+          <w:szCs w:val="24"/>
+          <w:u w:val="single"/>
+        </w:rPr>
+        <w:t>tekstualnu</w:t>
+      </w:r>
+      <w:proofErr w:type="spellEnd"/>
+      <w:r>
+        <w:rPr>
+          <w:rStyle w:val="Heading2Char"/>
+          <w:b/>
+          <w:bCs/>
+          <w:color w:val="auto"/>
+          <w:sz w:val="24"/>
+          <w:szCs w:val="24"/>
+          <w:u w:val="single"/>
+        </w:rPr>
+        <w:t xml:space="preserve"> </w:t>
+      </w:r>
+      <w:proofErr w:type="spellStart"/>
+      <w:r>
+        <w:rPr>
+          <w:rStyle w:val="Heading2Char"/>
+          <w:b/>
+          <w:bCs/>
+          <w:color w:val="auto"/>
+          <w:sz w:val="24"/>
+          <w:szCs w:val="24"/>
+          <w:u w:val="single"/>
+        </w:rPr>
+        <w:t>pretragu</w:t>
       </w:r>
       <w:bookmarkStart w:id="18" w:name="_Toc226745009"/>
       <w:bookmarkEnd w:id="17"/>
+      <w:proofErr w:type="spellEnd"/>
     </w:p>
     <w:p>
       <w:pPr>
@@ -2926,7 +3287,167 @@
           <w:sz w:val="24"/>
           <w:szCs w:val="24"/>
         </w:rPr>
-        <w:t xml:space="preserve">1. Korisnik u tekstualno polje unosi tekst po kom želi da pronađe komponente. </w:t>
+        <w:t xml:space="preserve">1. </w:t>
+      </w:r>
+      <w:proofErr w:type="spellStart"/>
+      <w:r>
+        <w:rPr>
+          <w:rStyle w:val="Heading2Char"/>
+          <w:color w:val="000000" w:themeColor="dark1"/>
+          <w:sz w:val="24"/>
+          <w:szCs w:val="24"/>
+        </w:rPr>
+        <w:t>Korisnik</w:t>
+      </w:r>
+      <w:proofErr w:type="spellEnd"/>
+      <w:r>
+        <w:rPr>
+          <w:rStyle w:val="Heading2Char"/>
+          <w:color w:val="000000" w:themeColor="dark1"/>
+          <w:sz w:val="24"/>
+          <w:szCs w:val="24"/>
+        </w:rPr>
+        <w:t xml:space="preserve"> u </w:t>
+      </w:r>
+      <w:proofErr w:type="spellStart"/>
+      <w:r>
+        <w:rPr>
+          <w:rStyle w:val="Heading2Char"/>
+          <w:color w:val="000000" w:themeColor="dark1"/>
+          <w:sz w:val="24"/>
+          <w:szCs w:val="24"/>
+        </w:rPr>
+        <w:t>tekstualno</w:t>
+      </w:r>
+      <w:proofErr w:type="spellEnd"/>
+      <w:r>
+        <w:rPr>
+          <w:rStyle w:val="Heading2Char"/>
+          <w:color w:val="000000" w:themeColor="dark1"/>
+          <w:sz w:val="24"/>
+          <w:szCs w:val="24"/>
+        </w:rPr>
+        <w:t xml:space="preserve"> polje </w:t>
+      </w:r>
+      <w:proofErr w:type="spellStart"/>
+      <w:r>
+        <w:rPr>
+          <w:rStyle w:val="Heading2Char"/>
+          <w:color w:val="000000" w:themeColor="dark1"/>
+          <w:sz w:val="24"/>
+          <w:szCs w:val="24"/>
+        </w:rPr>
+        <w:t>unosi</w:t>
+      </w:r>
+      <w:proofErr w:type="spellEnd"/>
+      <w:r>
+        <w:rPr>
+          <w:rStyle w:val="Heading2Char"/>
+          <w:color w:val="000000" w:themeColor="dark1"/>
+          <w:sz w:val="24"/>
+          <w:szCs w:val="24"/>
+        </w:rPr>
+        <w:t xml:space="preserve"> </w:t>
+      </w:r>
+      <w:proofErr w:type="spellStart"/>
+      <w:r>
+        <w:rPr>
+          <w:rStyle w:val="Heading2Char"/>
+          <w:color w:val="000000" w:themeColor="dark1"/>
+          <w:sz w:val="24"/>
+          <w:szCs w:val="24"/>
+        </w:rPr>
+        <w:t>tekst</w:t>
+      </w:r>
+      <w:proofErr w:type="spellEnd"/>
+      <w:r>
+        <w:rPr>
+          <w:rStyle w:val="Heading2Char"/>
+          <w:color w:val="000000" w:themeColor="dark1"/>
+          <w:sz w:val="24"/>
+          <w:szCs w:val="24"/>
+        </w:rPr>
+        <w:t xml:space="preserve"> po </w:t>
+      </w:r>
+      <w:proofErr w:type="spellStart"/>
+      <w:r>
+        <w:rPr>
+          <w:rStyle w:val="Heading2Char"/>
+          <w:color w:val="000000" w:themeColor="dark1"/>
+          <w:sz w:val="24"/>
+          <w:szCs w:val="24"/>
+        </w:rPr>
+        <w:t>kom</w:t>
+      </w:r>
+      <w:proofErr w:type="spellEnd"/>
+      <w:r>
+        <w:rPr>
+          <w:rStyle w:val="Heading2Char"/>
+          <w:color w:val="000000" w:themeColor="dark1"/>
+          <w:sz w:val="24"/>
+          <w:szCs w:val="24"/>
+        </w:rPr>
+        <w:t xml:space="preserve"> </w:t>
+      </w:r>
+      <w:proofErr w:type="spellStart"/>
+      <w:r>
+        <w:rPr>
+          <w:rStyle w:val="Heading2Char"/>
+          <w:color w:val="000000" w:themeColor="dark1"/>
+          <w:sz w:val="24"/>
+          <w:szCs w:val="24"/>
+        </w:rPr>
+        <w:t>želi</w:t>
+      </w:r>
+      <w:proofErr w:type="spellEnd"/>
+      <w:r>
+        <w:rPr>
+          <w:rStyle w:val="Heading2Char"/>
+          <w:color w:val="000000" w:themeColor="dark1"/>
+          <w:sz w:val="24"/>
+          <w:szCs w:val="24"/>
+        </w:rPr>
+        <w:t xml:space="preserve"> da </w:t>
+      </w:r>
+      <w:proofErr w:type="spellStart"/>
+      <w:r>
+        <w:rPr>
+          <w:rStyle w:val="Heading2Char"/>
+          <w:color w:val="000000" w:themeColor="dark1"/>
+          <w:sz w:val="24"/>
+          <w:szCs w:val="24"/>
+        </w:rPr>
+        <w:t>pronađe</w:t>
+      </w:r>
+      <w:proofErr w:type="spellEnd"/>
+      <w:r>
+        <w:rPr>
+          <w:rStyle w:val="Heading2Char"/>
+          <w:color w:val="000000" w:themeColor="dark1"/>
+          <w:sz w:val="24"/>
+          <w:szCs w:val="24"/>
+        </w:rPr>
+        <w:t xml:space="preserve"> </w:t>
+      </w:r>
+      <w:proofErr w:type="spellStart"/>
+      <w:r>
+        <w:rPr>
+          <w:rStyle w:val="Heading2Char"/>
+          <w:color w:val="000000" w:themeColor="dark1"/>
+          <w:sz w:val="24"/>
+          <w:szCs w:val="24"/>
+        </w:rPr>
+        <w:t>komponente</w:t>
+      </w:r>
+      <w:proofErr w:type="spellEnd"/>
+      <w:r>
+        <w:rPr>
+          <w:rStyle w:val="Heading2Char"/>
+          <w:color w:val="000000" w:themeColor="dark1"/>
+          <w:sz w:val="24"/>
+          <w:szCs w:val="24"/>
+        </w:rPr>
+        <w:t xml:space="preserve">. </w:t>
       </w:r>
       <w:r>
         <w:rPr>
@@ -2936,7 +3457,87 @@
           <w:szCs w:val="24"/>
         </w:rPr>
         <w:br/>
-        <w:t>2. Korisnik pritiska dugme za pretragu.</w:t>
+        <w:t xml:space="preserve">2. </w:t>
+      </w:r>
+      <w:proofErr w:type="spellStart"/>
+      <w:r>
+        <w:rPr>
+          <w:rStyle w:val="Heading2Char"/>
+          <w:color w:val="000000" w:themeColor="dark1"/>
+          <w:sz w:val="24"/>
+          <w:szCs w:val="24"/>
+        </w:rPr>
+        <w:t>Korisnik</w:t>
+      </w:r>
+      <w:proofErr w:type="spellEnd"/>
+      <w:r>
+        <w:rPr>
+          <w:rStyle w:val="Heading2Char"/>
+          <w:color w:val="000000" w:themeColor="dark1"/>
+          <w:sz w:val="24"/>
+          <w:szCs w:val="24"/>
+        </w:rPr>
+        <w:t xml:space="preserve"> </w:t>
+      </w:r>
+      <w:proofErr w:type="spellStart"/>
+      <w:r>
+        <w:rPr>
+          <w:rStyle w:val="Heading2Char"/>
+          <w:color w:val="000000" w:themeColor="dark1"/>
+          <w:sz w:val="24"/>
+          <w:szCs w:val="24"/>
+        </w:rPr>
+        <w:t>pritiska</w:t>
+      </w:r>
+      <w:proofErr w:type="spellEnd"/>
+      <w:r>
+        <w:rPr>
+          <w:rStyle w:val="Heading2Char"/>
+          <w:color w:val="000000" w:themeColor="dark1"/>
+          <w:sz w:val="24"/>
+          <w:szCs w:val="24"/>
+        </w:rPr>
+        <w:t xml:space="preserve"> </w:t>
+      </w:r>
+      <w:proofErr w:type="spellStart"/>
+      <w:r>
+        <w:rPr>
+          <w:rStyle w:val="Heading2Char"/>
+          <w:color w:val="000000" w:themeColor="dark1"/>
+          <w:sz w:val="24"/>
+          <w:szCs w:val="24"/>
+        </w:rPr>
+        <w:t>dugme</w:t>
+      </w:r>
+      <w:proofErr w:type="spellEnd"/>
+      <w:r>
+        <w:rPr>
+          <w:rStyle w:val="Heading2Char"/>
+          <w:color w:val="000000" w:themeColor="dark1"/>
+          <w:sz w:val="24"/>
+          <w:szCs w:val="24"/>
+        </w:rPr>
+        <w:t xml:space="preserve"> za </w:t>
+      </w:r>
+      <w:proofErr w:type="spellStart"/>
+      <w:r>
+        <w:rPr>
+          <w:rStyle w:val="Heading2Char"/>
+          <w:color w:val="000000" w:themeColor="dark1"/>
+          <w:sz w:val="24"/>
+          <w:szCs w:val="24"/>
+        </w:rPr>
+        <w:t>pretragu</w:t>
+      </w:r>
+      <w:proofErr w:type="spellEnd"/>
+      <w:r>
+        <w:rPr>
+          <w:rStyle w:val="Heading2Char"/>
+          <w:color w:val="000000" w:themeColor="dark1"/>
+          <w:sz w:val="24"/>
+          <w:szCs w:val="24"/>
+        </w:rPr>
+        <w:t>.</w:t>
       </w:r>
       <w:r>
         <w:rPr>
@@ -2946,7 +3547,267 @@
           <w:szCs w:val="24"/>
         </w:rPr>
         <w:br/>
-        <w:t>2. Iz baze podataka se uzimaju komponente koje u svom imenu ili opisu sadrže dati tekst.</w:t>
+        <w:t xml:space="preserve">2. </w:t>
+      </w:r>
+      <w:proofErr w:type="spellStart"/>
+      <w:r>
+        <w:rPr>
+          <w:rStyle w:val="Heading2Char"/>
+          <w:color w:val="000000" w:themeColor="dark1"/>
+          <w:sz w:val="24"/>
+          <w:szCs w:val="24"/>
+        </w:rPr>
+        <w:t>Iz</w:t>
+      </w:r>
+      <w:proofErr w:type="spellEnd"/>
+      <w:r>
+        <w:rPr>
+          <w:rStyle w:val="Heading2Char"/>
+          <w:color w:val="000000" w:themeColor="dark1"/>
+          <w:sz w:val="24"/>
+          <w:szCs w:val="24"/>
+        </w:rPr>
+        <w:t xml:space="preserve"> </w:t>
+      </w:r>
+      <w:proofErr w:type="spellStart"/>
+      <w:r>
+        <w:rPr>
+          <w:rStyle w:val="Heading2Char"/>
+          <w:color w:val="000000" w:themeColor="dark1"/>
+          <w:sz w:val="24"/>
+          <w:szCs w:val="24"/>
+        </w:rPr>
+        <w:t>baze</w:t>
+      </w:r>
+      <w:proofErr w:type="spellEnd"/>
+      <w:r>
+        <w:rPr>
+          <w:rStyle w:val="Heading2Char"/>
+          <w:color w:val="000000" w:themeColor="dark1"/>
+          <w:sz w:val="24"/>
+          <w:szCs w:val="24"/>
+        </w:rPr>
+        <w:t xml:space="preserve"> </w:t>
+      </w:r>
+      <w:proofErr w:type="spellStart"/>
+      <w:r>
+        <w:rPr>
+          <w:rStyle w:val="Heading2Char"/>
+          <w:color w:val="000000" w:themeColor="dark1"/>
+          <w:sz w:val="24"/>
+          <w:szCs w:val="24"/>
+        </w:rPr>
+        <w:t>podataka</w:t>
+      </w:r>
+      <w:proofErr w:type="spellEnd"/>
+      <w:r>
+        <w:rPr>
+          <w:rStyle w:val="Heading2Char"/>
+          <w:color w:val="000000" w:themeColor="dark1"/>
+          <w:sz w:val="24"/>
+          <w:szCs w:val="24"/>
+        </w:rPr>
+        <w:t xml:space="preserve"> se </w:t>
+      </w:r>
+      <w:proofErr w:type="spellStart"/>
+      <w:r>
+        <w:rPr>
+          <w:rStyle w:val="Heading2Char"/>
+          <w:color w:val="000000" w:themeColor="dark1"/>
+          <w:sz w:val="24"/>
+          <w:szCs w:val="24"/>
+        </w:rPr>
+        <w:t>uzimaju</w:t>
+      </w:r>
+      <w:proofErr w:type="spellEnd"/>
+      <w:r>
+        <w:rPr>
+          <w:rStyle w:val="Heading2Char"/>
+          <w:color w:val="000000" w:themeColor="dark1"/>
+          <w:sz w:val="24"/>
+          <w:szCs w:val="24"/>
+        </w:rPr>
+        <w:t xml:space="preserve"> </w:t>
+      </w:r>
+      <w:proofErr w:type="spellStart"/>
+      <w:r>
+        <w:rPr>
+          <w:rStyle w:val="Heading2Char"/>
+          <w:color w:val="000000" w:themeColor="dark1"/>
+          <w:sz w:val="24"/>
+          <w:szCs w:val="24"/>
+        </w:rPr>
+        <w:t>komponente</w:t>
+      </w:r>
+      <w:proofErr w:type="spellEnd"/>
+      <w:r>
+        <w:rPr>
+          <w:rStyle w:val="Heading2Char"/>
+          <w:color w:val="000000" w:themeColor="dark1"/>
+          <w:sz w:val="24"/>
+          <w:szCs w:val="24"/>
+        </w:rPr>
+        <w:t xml:space="preserve"> </w:t>
+      </w:r>
+      <w:proofErr w:type="spellStart"/>
+      <w:r>
+        <w:rPr>
+          <w:rStyle w:val="Heading2Char"/>
+          <w:color w:val="000000" w:themeColor="dark1"/>
+          <w:sz w:val="24"/>
+          <w:szCs w:val="24"/>
+        </w:rPr>
+        <w:t>koje</w:t>
+      </w:r>
+      <w:proofErr w:type="spellEnd"/>
+      <w:r>
+        <w:rPr>
+          <w:rStyle w:val="Heading2Char"/>
+          <w:color w:val="000000" w:themeColor="dark1"/>
+          <w:sz w:val="24"/>
+          <w:szCs w:val="24"/>
+        </w:rPr>
+        <w:t xml:space="preserve"> u </w:t>
+      </w:r>
+      <w:proofErr w:type="spellStart"/>
+      <w:r>
+        <w:rPr>
+          <w:rStyle w:val="Heading2Char"/>
+          <w:color w:val="000000" w:themeColor="dark1"/>
+          <w:sz w:val="24"/>
+          <w:szCs w:val="24"/>
+        </w:rPr>
+        <w:t>svom</w:t>
+      </w:r>
+      <w:proofErr w:type="spellEnd"/>
+      <w:r>
+        <w:rPr>
+          <w:rStyle w:val="Heading2Char"/>
+          <w:color w:val="000000" w:themeColor="dark1"/>
+          <w:sz w:val="24"/>
+          <w:szCs w:val="24"/>
+        </w:rPr>
+        <w:t xml:space="preserve"> </w:t>
+      </w:r>
+      <w:proofErr w:type="spellStart"/>
+      <w:r>
+        <w:rPr>
+          <w:rStyle w:val="Heading2Char"/>
+          <w:color w:val="000000" w:themeColor="dark1"/>
+          <w:sz w:val="24"/>
+          <w:szCs w:val="24"/>
+        </w:rPr>
+        <w:t>imenu</w:t>
+      </w:r>
+      <w:proofErr w:type="spellEnd"/>
+      <w:r>
+        <w:rPr>
+          <w:rStyle w:val="Heading2Char"/>
+          <w:color w:val="000000" w:themeColor="dark1"/>
+          <w:sz w:val="24"/>
+          <w:szCs w:val="24"/>
+        </w:rPr>
+        <w:t xml:space="preserve"> </w:t>
+      </w:r>
+      <w:proofErr w:type="spellStart"/>
+      <w:r>
+        <w:rPr>
+          <w:rStyle w:val="Heading2Char"/>
+          <w:color w:val="000000" w:themeColor="dark1"/>
+          <w:sz w:val="24"/>
+          <w:szCs w:val="24"/>
+        </w:rPr>
+        <w:t>ili</w:t>
+      </w:r>
+      <w:proofErr w:type="spellEnd"/>
+      <w:r>
+        <w:rPr>
+          <w:rStyle w:val="Heading2Char"/>
+          <w:color w:val="000000" w:themeColor="dark1"/>
+          <w:sz w:val="24"/>
+          <w:szCs w:val="24"/>
+        </w:rPr>
+        <w:t xml:space="preserve"> </w:t>
+      </w:r>
+      <w:proofErr w:type="spellStart"/>
+      <w:r>
+        <w:rPr>
+          <w:rStyle w:val="Heading2Char"/>
+          <w:color w:val="000000" w:themeColor="dark1"/>
+          <w:sz w:val="24"/>
+          <w:szCs w:val="24"/>
+        </w:rPr>
+        <w:t>opisu</w:t>
+      </w:r>
+      <w:proofErr w:type="spellEnd"/>
+      <w:r>
+        <w:rPr>
+          <w:rStyle w:val="Heading2Char"/>
+          <w:color w:val="000000" w:themeColor="dark1"/>
+          <w:sz w:val="24"/>
+          <w:szCs w:val="24"/>
+        </w:rPr>
+        <w:t xml:space="preserve"> </w:t>
+      </w:r>
+      <w:proofErr w:type="spellStart"/>
+      <w:r>
+        <w:rPr>
+          <w:rStyle w:val="Heading2Char"/>
+          <w:color w:val="000000" w:themeColor="dark1"/>
+          <w:sz w:val="24"/>
+          <w:szCs w:val="24"/>
+        </w:rPr>
+        <w:t>sadrže</w:t>
+      </w:r>
+      <w:proofErr w:type="spellEnd"/>
+      <w:r>
+        <w:rPr>
+          <w:rStyle w:val="Heading2Char"/>
+          <w:color w:val="000000" w:themeColor="dark1"/>
+          <w:sz w:val="24"/>
+          <w:szCs w:val="24"/>
+        </w:rPr>
+        <w:t xml:space="preserve"> </w:t>
+      </w:r>
+      <w:proofErr w:type="spellStart"/>
+      <w:r>
+        <w:rPr>
+          <w:rStyle w:val="Heading2Char"/>
+          <w:color w:val="000000" w:themeColor="dark1"/>
+          <w:sz w:val="24"/>
+          <w:szCs w:val="24"/>
+        </w:rPr>
+        <w:t>dati</w:t>
+      </w:r>
+      <w:proofErr w:type="spellEnd"/>
+      <w:r>
+        <w:rPr>
+          <w:rStyle w:val="Heading2Char"/>
+          <w:color w:val="000000" w:themeColor="dark1"/>
+          <w:sz w:val="24"/>
+          <w:szCs w:val="24"/>
+        </w:rPr>
+        <w:t xml:space="preserve"> </w:t>
+      </w:r>
+      <w:proofErr w:type="spellStart"/>
+      <w:r>
+        <w:rPr>
+          <w:rStyle w:val="Heading2Char"/>
+          <w:color w:val="000000" w:themeColor="dark1"/>
+          <w:sz w:val="24"/>
+          <w:szCs w:val="24"/>
+        </w:rPr>
+        <w:t>tekst</w:t>
+      </w:r>
+      <w:proofErr w:type="spellEnd"/>
+      <w:r>
+        <w:rPr>
+          <w:rStyle w:val="Heading2Char"/>
+          <w:color w:val="000000" w:themeColor="dark1"/>
+          <w:sz w:val="24"/>
+          <w:szCs w:val="24"/>
+        </w:rPr>
+        <w:t>.</w:t>
       </w:r>
       <w:r>
         <w:rPr>
@@ -2956,7 +3817,187 @@
           <w:szCs w:val="24"/>
         </w:rPr>
         <w:br/>
-        <w:t>3. Korisniku se na ekranu prikazuju komponente koje su rezultat pretrage.</w:t>
+        <w:t xml:space="preserve">3. </w:t>
+      </w:r>
+      <w:proofErr w:type="spellStart"/>
+      <w:r>
+        <w:rPr>
+          <w:rStyle w:val="Heading2Char"/>
+          <w:color w:val="000000" w:themeColor="dark1"/>
+          <w:sz w:val="24"/>
+          <w:szCs w:val="24"/>
+        </w:rPr>
+        <w:t>Korisniku</w:t>
+      </w:r>
+      <w:proofErr w:type="spellEnd"/>
+      <w:r>
+        <w:rPr>
+          <w:rStyle w:val="Heading2Char"/>
+          <w:color w:val="000000" w:themeColor="dark1"/>
+          <w:sz w:val="24"/>
+          <w:szCs w:val="24"/>
+        </w:rPr>
+        <w:t xml:space="preserve"> se </w:t>
+      </w:r>
+      <w:proofErr w:type="spellStart"/>
+      <w:r>
+        <w:rPr>
+          <w:rStyle w:val="Heading2Char"/>
+          <w:color w:val="000000" w:themeColor="dark1"/>
+          <w:sz w:val="24"/>
+          <w:szCs w:val="24"/>
+        </w:rPr>
+        <w:t>na</w:t>
+      </w:r>
+      <w:proofErr w:type="spellEnd"/>
+      <w:r>
+        <w:rPr>
+          <w:rStyle w:val="Heading2Char"/>
+          <w:color w:val="000000" w:themeColor="dark1"/>
+          <w:sz w:val="24"/>
+          <w:szCs w:val="24"/>
+        </w:rPr>
+        <w:t xml:space="preserve"> </w:t>
+      </w:r>
+      <w:proofErr w:type="spellStart"/>
+      <w:r>
+        <w:rPr>
+          <w:rStyle w:val="Heading2Char"/>
+          <w:color w:val="000000" w:themeColor="dark1"/>
+          <w:sz w:val="24"/>
+          <w:szCs w:val="24"/>
+        </w:rPr>
+        <w:t>ekranu</w:t>
+      </w:r>
+      <w:proofErr w:type="spellEnd"/>
+      <w:r>
+        <w:rPr>
+          <w:rStyle w:val="Heading2Char"/>
+          <w:color w:val="000000" w:themeColor="dark1"/>
+          <w:sz w:val="24"/>
+          <w:szCs w:val="24"/>
+        </w:rPr>
+        <w:t xml:space="preserve"> </w:t>
+      </w:r>
+      <w:proofErr w:type="spellStart"/>
+      <w:r>
+        <w:rPr>
+          <w:rStyle w:val="Heading2Char"/>
+          <w:color w:val="000000" w:themeColor="dark1"/>
+          <w:sz w:val="24"/>
+          <w:szCs w:val="24"/>
+        </w:rPr>
+        <w:t>prikazuju</w:t>
+      </w:r>
+      <w:proofErr w:type="spellEnd"/>
+      <w:r>
+        <w:rPr>
+          <w:rStyle w:val="Heading2Char"/>
+          <w:color w:val="000000" w:themeColor="dark1"/>
+          <w:sz w:val="24"/>
+          <w:szCs w:val="24"/>
+        </w:rPr>
+        <w:t xml:space="preserve"> </w:t>
+      </w:r>
+      <w:proofErr w:type="spellStart"/>
+      <w:r>
+        <w:rPr>
+          <w:rStyle w:val="Heading2Char"/>
+          <w:color w:val="000000" w:themeColor="dark1"/>
+          <w:sz w:val="24"/>
+          <w:szCs w:val="24"/>
+        </w:rPr>
+        <w:t>komponente</w:t>
+      </w:r>
+      <w:proofErr w:type="spellEnd"/>
+      <w:r>
+        <w:rPr>
+          <w:rStyle w:val="Heading2Char"/>
+          <w:color w:val="000000" w:themeColor="dark1"/>
+          <w:sz w:val="24"/>
+          <w:szCs w:val="24"/>
+        </w:rPr>
+        <w:t xml:space="preserve"> </w:t>
+      </w:r>
+      <w:proofErr w:type="spellStart"/>
+      <w:r>
+        <w:rPr>
+          <w:rStyle w:val="Heading2Char"/>
+          <w:color w:val="000000" w:themeColor="dark1"/>
+          <w:sz w:val="24"/>
+          <w:szCs w:val="24"/>
+        </w:rPr>
+        <w:t>koje</w:t>
+      </w:r>
+      <w:proofErr w:type="spellEnd"/>
+      <w:r>
+        <w:rPr>
+          <w:rStyle w:val="Heading2Char"/>
+          <w:color w:val="000000" w:themeColor="dark1"/>
+          <w:sz w:val="24"/>
+          <w:szCs w:val="24"/>
+        </w:rPr>
+        <w:t xml:space="preserve"> </w:t>
+      </w:r>
+      <w:proofErr w:type="spellStart"/>
+      <w:r>
+        <w:rPr>
+          <w:rStyle w:val="Heading2Char"/>
+          <w:color w:val="000000" w:themeColor="dark1"/>
+          <w:sz w:val="24"/>
+          <w:szCs w:val="24"/>
+        </w:rPr>
+        <w:t>su</w:t>
+      </w:r>
+      <w:proofErr w:type="spellEnd"/>
+      <w:r>
+        <w:rPr>
+          <w:rStyle w:val="Heading2Char"/>
+          <w:color w:val="000000" w:themeColor="dark1"/>
+          <w:sz w:val="24"/>
+          <w:szCs w:val="24"/>
+        </w:rPr>
+        <w:t xml:space="preserve"> </w:t>
+      </w:r>
+      <w:proofErr w:type="spellStart"/>
+      <w:r>
+        <w:rPr>
+          <w:rStyle w:val="Heading2Char"/>
+          <w:color w:val="000000" w:themeColor="dark1"/>
+          <w:sz w:val="24"/>
+          <w:szCs w:val="24"/>
+        </w:rPr>
+        <w:t>rezultat</w:t>
+      </w:r>
+      <w:proofErr w:type="spellEnd"/>
+      <w:r>
+        <w:rPr>
+          <w:rStyle w:val="Heading2Char"/>
+          <w:color w:val="000000" w:themeColor="dark1"/>
+          <w:sz w:val="24"/>
+          <w:szCs w:val="24"/>
+        </w:rPr>
+        <w:t xml:space="preserve"> </w:t>
+      </w:r>
+      <w:proofErr w:type="spellStart"/>
+      <w:r>
+        <w:rPr>
+          <w:rStyle w:val="Heading2Char"/>
+          <w:color w:val="000000" w:themeColor="dark1"/>
+          <w:sz w:val="24"/>
+          <w:szCs w:val="24"/>
+        </w:rPr>
+        <w:t>pretrage</w:t>
+      </w:r>
+      <w:proofErr w:type="spellEnd"/>
+      <w:r>
+        <w:rPr>
+          <w:rStyle w:val="Heading2Char"/>
+          <w:color w:val="000000" w:themeColor="dark1"/>
+          <w:sz w:val="24"/>
+          <w:szCs w:val="24"/>
+        </w:rPr>
+        <w:t>.</w:t>
       </w:r>
       <w:bookmarkEnd w:id="18"/>
     </w:p>
@@ -2974,7 +4015,7 @@
       <w:pPr>
         <w:pStyle w:val="Heading3"/>
         <w:rPr>
-          <w:rStyle w:val="Heading2Char"/>
+          <w:rFonts w:ascii="Calibri Light" w:hAnsi="Calibri Light"/>
           <w:b/>
           <w:bCs/>
           <w:color w:val="auto"/>
@@ -3007,6 +4048,7 @@
         </w:rPr>
         <w:tab/>
       </w:r>
+      <w:proofErr w:type="spellStart"/>
       <w:r>
         <w:rPr>
           <w:rStyle w:val="Heading2Char"/>
@@ -3017,29 +4059,141 @@
           <w:szCs w:val="24"/>
           <w:u w:val="single"/>
         </w:rPr>
-        <w:t>Korisnik se odlučuje na pretragu pomoću filtera</w:t>
+        <w:t>Korisnik</w:t>
+      </w:r>
+      <w:proofErr w:type="spellEnd"/>
+      <w:r>
+        <w:rPr>
+          <w:rStyle w:val="Heading2Char"/>
+          <w:b/>
+          <w:bCs/>
+          <w:color w:val="auto"/>
+          <w:sz w:val="24"/>
+          <w:szCs w:val="24"/>
+          <w:u w:val="single"/>
+        </w:rPr>
+        <w:t xml:space="preserve"> se </w:t>
+      </w:r>
+      <w:proofErr w:type="spellStart"/>
+      <w:r>
+        <w:rPr>
+          <w:rStyle w:val="Heading2Char"/>
+          <w:b/>
+          <w:bCs/>
+          <w:color w:val="auto"/>
+          <w:sz w:val="24"/>
+          <w:szCs w:val="24"/>
+          <w:u w:val="single"/>
+        </w:rPr>
+        <w:t>odlučuje</w:t>
+      </w:r>
+      <w:proofErr w:type="spellEnd"/>
+      <w:r>
+        <w:rPr>
+          <w:rStyle w:val="Heading2Char"/>
+          <w:b/>
+          <w:bCs/>
+          <w:color w:val="auto"/>
+          <w:sz w:val="24"/>
+          <w:szCs w:val="24"/>
+          <w:u w:val="single"/>
+        </w:rPr>
+        <w:t xml:space="preserve"> </w:t>
+      </w:r>
+      <w:proofErr w:type="spellStart"/>
+      <w:r>
+        <w:rPr>
+          <w:rStyle w:val="Heading2Char"/>
+          <w:b/>
+          <w:bCs/>
+          <w:color w:val="auto"/>
+          <w:sz w:val="24"/>
+          <w:szCs w:val="24"/>
+          <w:u w:val="single"/>
+        </w:rPr>
+        <w:t>na</w:t>
+      </w:r>
+      <w:proofErr w:type="spellEnd"/>
+      <w:r>
+        <w:rPr>
+          <w:rStyle w:val="Heading2Char"/>
+          <w:b/>
+          <w:bCs/>
+          <w:color w:val="auto"/>
+          <w:sz w:val="24"/>
+          <w:szCs w:val="24"/>
+          <w:u w:val="single"/>
+        </w:rPr>
+        <w:t xml:space="preserve"> </w:t>
+      </w:r>
+      <w:proofErr w:type="spellStart"/>
+      <w:r>
+        <w:rPr>
+          <w:rStyle w:val="Heading2Char"/>
+          <w:b/>
+          <w:bCs/>
+          <w:color w:val="auto"/>
+          <w:sz w:val="24"/>
+          <w:szCs w:val="24"/>
+          <w:u w:val="single"/>
+        </w:rPr>
+        <w:t>pretragu</w:t>
+      </w:r>
+      <w:proofErr w:type="spellEnd"/>
+      <w:r>
+        <w:rPr>
+          <w:rStyle w:val="Heading2Char"/>
+          <w:b/>
+          <w:bCs/>
+          <w:color w:val="auto"/>
+          <w:sz w:val="24"/>
+          <w:szCs w:val="24"/>
+          <w:u w:val="single"/>
+        </w:rPr>
+        <w:t xml:space="preserve"> </w:t>
+      </w:r>
+      <w:proofErr w:type="spellStart"/>
+      <w:r>
+        <w:rPr>
+          <w:rStyle w:val="Heading2Char"/>
+          <w:b/>
+          <w:bCs/>
+          <w:color w:val="auto"/>
+          <w:sz w:val="24"/>
+          <w:szCs w:val="24"/>
+          <w:u w:val="single"/>
+        </w:rPr>
+        <w:t>pomoću</w:t>
+      </w:r>
+      <w:proofErr w:type="spellEnd"/>
+      <w:r>
+        <w:rPr>
+          <w:rStyle w:val="Heading2Char"/>
+          <w:b/>
+          <w:bCs/>
+          <w:color w:val="auto"/>
+          <w:sz w:val="24"/>
+          <w:szCs w:val="24"/>
+          <w:u w:val="single"/>
+        </w:rPr>
+        <w:t xml:space="preserve"> </w:t>
+      </w:r>
+      <w:proofErr w:type="spellStart"/>
+      <w:r>
+        <w:rPr>
+          <w:rStyle w:val="Heading2Char"/>
+          <w:b/>
+          <w:bCs/>
+          <w:color w:val="auto"/>
+          <w:sz w:val="24"/>
+          <w:szCs w:val="24"/>
+          <w:u w:val="single"/>
+        </w:rPr>
+        <w:t>filtera</w:t>
       </w:r>
       <w:bookmarkStart w:id="20" w:name="_Toc226745011"/>
       <w:bookmarkEnd w:id="19"/>
-    </w:p>
-    <w:p>
-      <w:pPr>
-        <w:pStyle w:val="Heading3"/>
-        <w:rPr>
-          <w:b/>
-          <w:bCs/>
-          <w:color w:val="auto"/>
-        </w:rPr>
-      </w:pPr>
-      <w:r>
-        <w:rPr>
-          <w:rStyle w:val="Heading2Char"/>
-          <w:color w:val="000000" w:themeColor="dark1"/>
-          <w:sz w:val="24"/>
-          <w:szCs w:val="24"/>
-        </w:rPr>
-        <w:t>1. Korisnik pritiska dugme za filtriranje i tada se spušta padajući meni sa kriterijumima za filtriranje.</w:t>
-      </w:r>
+      <w:proofErr w:type="spellEnd"/>
       <w:r>
         <w:rPr>
           <w:rStyle w:val="Heading2Char"/>
@@ -3048,7 +4202,284 @@
           <w:szCs w:val="24"/>
         </w:rPr>
         <w:br/>
-        <w:t>2. Korisnik klikom na kriterijume za filtriranje odabira koje od njih želi da iskoristi pri filtriranju.</w:t>
+      </w:r>
+      <w:r>
+        <w:rPr>
+          <w:rStyle w:val="Heading2Char"/>
+          <w:color w:val="000000" w:themeColor="dark1"/>
+          <w:sz w:val="24"/>
+          <w:szCs w:val="24"/>
+        </w:rPr>
+        <w:t>1</w:t>
+      </w:r>
+      <w:r>
+        <w:rPr>
+          <w:rStyle w:val="Heading2Char"/>
+          <w:color w:val="000000" w:themeColor="dark1"/>
+          <w:sz w:val="24"/>
+          <w:szCs w:val="24"/>
+        </w:rPr>
+        <w:t xml:space="preserve">. </w:t>
+      </w:r>
+      <w:proofErr w:type="spellStart"/>
+      <w:r>
+        <w:rPr>
+          <w:rStyle w:val="Heading2Char"/>
+          <w:color w:val="000000" w:themeColor="dark1"/>
+          <w:sz w:val="24"/>
+          <w:szCs w:val="24"/>
+        </w:rPr>
+        <w:t>Korisnik</w:t>
+      </w:r>
+      <w:proofErr w:type="spellEnd"/>
+      <w:r>
+        <w:rPr>
+          <w:rStyle w:val="Heading2Char"/>
+          <w:color w:val="000000" w:themeColor="dark1"/>
+          <w:sz w:val="24"/>
+          <w:szCs w:val="24"/>
+        </w:rPr>
+        <w:t xml:space="preserve"> </w:t>
+      </w:r>
+      <w:proofErr w:type="spellStart"/>
+      <w:r>
+        <w:rPr>
+          <w:rStyle w:val="Heading2Char"/>
+          <w:color w:val="000000" w:themeColor="dark1"/>
+          <w:sz w:val="24"/>
+          <w:szCs w:val="24"/>
+        </w:rPr>
+        <w:t>klikom</w:t>
+      </w:r>
+      <w:proofErr w:type="spellEnd"/>
+      <w:r>
+        <w:rPr>
+          <w:rStyle w:val="Heading2Char"/>
+          <w:color w:val="000000" w:themeColor="dark1"/>
+          <w:sz w:val="24"/>
+          <w:szCs w:val="24"/>
+        </w:rPr>
+        <w:t xml:space="preserve"> </w:t>
+      </w:r>
+      <w:proofErr w:type="spellStart"/>
+      <w:r>
+        <w:rPr>
+          <w:rStyle w:val="Heading2Char"/>
+          <w:color w:val="000000" w:themeColor="dark1"/>
+          <w:sz w:val="24"/>
+          <w:szCs w:val="24"/>
+        </w:rPr>
+        <w:t>na</w:t>
+      </w:r>
+      <w:proofErr w:type="spellEnd"/>
+      <w:r>
+        <w:rPr>
+          <w:rStyle w:val="Heading2Char"/>
+          <w:color w:val="000000" w:themeColor="dark1"/>
+          <w:sz w:val="24"/>
+          <w:szCs w:val="24"/>
+        </w:rPr>
+        <w:t xml:space="preserve"> </w:t>
+      </w:r>
+      <w:proofErr w:type="spellStart"/>
+      <w:r>
+        <w:rPr>
+          <w:rStyle w:val="Heading2Char"/>
+          <w:color w:val="000000" w:themeColor="dark1"/>
+          <w:sz w:val="24"/>
+          <w:szCs w:val="24"/>
+        </w:rPr>
+        <w:t>kriterijume</w:t>
+      </w:r>
+      <w:proofErr w:type="spellEnd"/>
+      <w:r>
+        <w:rPr>
+          <w:rStyle w:val="Heading2Char"/>
+          <w:color w:val="000000" w:themeColor="dark1"/>
+          <w:sz w:val="24"/>
+          <w:szCs w:val="24"/>
+        </w:rPr>
+        <w:t xml:space="preserve"> za </w:t>
+      </w:r>
+      <w:proofErr w:type="spellStart"/>
+      <w:r>
+        <w:rPr>
+          <w:rStyle w:val="Heading2Char"/>
+          <w:color w:val="000000" w:themeColor="dark1"/>
+          <w:sz w:val="24"/>
+          <w:szCs w:val="24"/>
+        </w:rPr>
+        <w:t>filtriranje</w:t>
+      </w:r>
+      <w:proofErr w:type="spellEnd"/>
+      <w:r>
+        <w:rPr>
+          <w:rStyle w:val="Heading2Char"/>
+          <w:color w:val="000000" w:themeColor="dark1"/>
+          <w:sz w:val="24"/>
+          <w:szCs w:val="24"/>
+        </w:rPr>
+        <w:t xml:space="preserve"> </w:t>
+      </w:r>
+      <w:proofErr w:type="spellStart"/>
+      <w:r>
+        <w:rPr>
+          <w:rStyle w:val="Heading2Char"/>
+          <w:color w:val="000000" w:themeColor="dark1"/>
+          <w:sz w:val="24"/>
+          <w:szCs w:val="24"/>
+        </w:rPr>
+        <w:t>odabira</w:t>
+      </w:r>
+      <w:proofErr w:type="spellEnd"/>
+      <w:r>
+        <w:rPr>
+          <w:rStyle w:val="Heading2Char"/>
+          <w:color w:val="000000" w:themeColor="dark1"/>
+          <w:sz w:val="24"/>
+          <w:szCs w:val="24"/>
+        </w:rPr>
+        <w:t xml:space="preserve"> </w:t>
+      </w:r>
+      <w:proofErr w:type="spellStart"/>
+      <w:r>
+        <w:rPr>
+          <w:rStyle w:val="Heading2Char"/>
+          <w:color w:val="000000" w:themeColor="dark1"/>
+          <w:sz w:val="24"/>
+          <w:szCs w:val="24"/>
+        </w:rPr>
+        <w:t>koje</w:t>
+      </w:r>
+      <w:proofErr w:type="spellEnd"/>
+      <w:r>
+        <w:rPr>
+          <w:rStyle w:val="Heading2Char"/>
+          <w:color w:val="000000" w:themeColor="dark1"/>
+          <w:sz w:val="24"/>
+          <w:szCs w:val="24"/>
+        </w:rPr>
+        <w:t xml:space="preserve"> </w:t>
+      </w:r>
+      <w:proofErr w:type="spellStart"/>
+      <w:r>
+        <w:rPr>
+          <w:rStyle w:val="Heading2Char"/>
+          <w:color w:val="000000" w:themeColor="dark1"/>
+          <w:sz w:val="24"/>
+          <w:szCs w:val="24"/>
+        </w:rPr>
+        <w:t>od</w:t>
+      </w:r>
+      <w:proofErr w:type="spellEnd"/>
+      <w:r>
+        <w:rPr>
+          <w:rStyle w:val="Heading2Char"/>
+          <w:color w:val="000000" w:themeColor="dark1"/>
+          <w:sz w:val="24"/>
+          <w:szCs w:val="24"/>
+        </w:rPr>
+        <w:t xml:space="preserve"> </w:t>
+      </w:r>
+      <w:proofErr w:type="spellStart"/>
+      <w:r>
+        <w:rPr>
+          <w:rStyle w:val="Heading2Char"/>
+          <w:color w:val="000000" w:themeColor="dark1"/>
+          <w:sz w:val="24"/>
+          <w:szCs w:val="24"/>
+        </w:rPr>
+        <w:t>njih</w:t>
+      </w:r>
+      <w:proofErr w:type="spellEnd"/>
+      <w:r>
+        <w:rPr>
+          <w:rStyle w:val="Heading2Char"/>
+          <w:color w:val="000000" w:themeColor="dark1"/>
+          <w:sz w:val="24"/>
+          <w:szCs w:val="24"/>
+        </w:rPr>
+        <w:t xml:space="preserve"> </w:t>
+      </w:r>
+      <w:proofErr w:type="spellStart"/>
+      <w:r>
+        <w:rPr>
+          <w:rStyle w:val="Heading2Char"/>
+          <w:color w:val="000000" w:themeColor="dark1"/>
+          <w:sz w:val="24"/>
+          <w:szCs w:val="24"/>
+        </w:rPr>
+        <w:t>želi</w:t>
+      </w:r>
+      <w:proofErr w:type="spellEnd"/>
+      <w:r>
+        <w:rPr>
+          <w:rStyle w:val="Heading2Char"/>
+          <w:color w:val="000000" w:themeColor="dark1"/>
+          <w:sz w:val="24"/>
+          <w:szCs w:val="24"/>
+        </w:rPr>
+        <w:t xml:space="preserve"> da </w:t>
+      </w:r>
+      <w:proofErr w:type="spellStart"/>
+      <w:r>
+        <w:rPr>
+          <w:rStyle w:val="Heading2Char"/>
+          <w:color w:val="000000" w:themeColor="dark1"/>
+          <w:sz w:val="24"/>
+          <w:szCs w:val="24"/>
+        </w:rPr>
+        <w:t>iskoristi</w:t>
+      </w:r>
+      <w:proofErr w:type="spellEnd"/>
+      <w:r>
+        <w:rPr>
+          <w:rStyle w:val="Heading2Char"/>
+          <w:color w:val="000000" w:themeColor="dark1"/>
+          <w:sz w:val="24"/>
+          <w:szCs w:val="24"/>
+        </w:rPr>
+        <w:t xml:space="preserve"> </w:t>
+      </w:r>
+      <w:proofErr w:type="spellStart"/>
+      <w:r>
+        <w:rPr>
+          <w:rStyle w:val="Heading2Char"/>
+          <w:color w:val="000000" w:themeColor="dark1"/>
+          <w:sz w:val="24"/>
+          <w:szCs w:val="24"/>
+        </w:rPr>
+        <w:t>pri</w:t>
+      </w:r>
+      <w:proofErr w:type="spellEnd"/>
+      <w:r>
+        <w:rPr>
+          <w:rStyle w:val="Heading2Char"/>
+          <w:color w:val="000000" w:themeColor="dark1"/>
+          <w:sz w:val="24"/>
+          <w:szCs w:val="24"/>
+        </w:rPr>
+        <w:t xml:space="preserve"> </w:t>
+      </w:r>
+      <w:proofErr w:type="spellStart"/>
+      <w:r>
+        <w:rPr>
+          <w:rStyle w:val="Heading2Char"/>
+          <w:color w:val="000000" w:themeColor="dark1"/>
+          <w:sz w:val="24"/>
+          <w:szCs w:val="24"/>
+        </w:rPr>
+        <w:t>filtriranju</w:t>
+      </w:r>
+      <w:proofErr w:type="spellEnd"/>
+      <w:r>
+        <w:rPr>
+          <w:rStyle w:val="Heading2Char"/>
+          <w:color w:val="000000" w:themeColor="dark1"/>
+          <w:sz w:val="24"/>
+          <w:szCs w:val="24"/>
+        </w:rPr>
+        <w:t>.</w:t>
       </w:r>
       <w:r>
         <w:rPr>
@@ -3058,7 +4489,104 @@
           <w:szCs w:val="24"/>
         </w:rPr>
         <w:br/>
-        <w:t>3. Korisnik pritiska dugme za pretragu.</w:t>
+      </w:r>
+      <w:r>
+        <w:rPr>
+          <w:rStyle w:val="Heading2Char"/>
+          <w:color w:val="000000" w:themeColor="dark1"/>
+          <w:sz w:val="24"/>
+          <w:szCs w:val="24"/>
+        </w:rPr>
+        <w:t>2</w:t>
+      </w:r>
+      <w:r>
+        <w:rPr>
+          <w:rStyle w:val="Heading2Char"/>
+          <w:color w:val="000000" w:themeColor="dark1"/>
+          <w:sz w:val="24"/>
+          <w:szCs w:val="24"/>
+        </w:rPr>
+        <w:t xml:space="preserve">. </w:t>
+      </w:r>
+      <w:proofErr w:type="spellStart"/>
+      <w:r>
+        <w:rPr>
+          <w:rStyle w:val="Heading2Char"/>
+          <w:color w:val="000000" w:themeColor="dark1"/>
+          <w:sz w:val="24"/>
+          <w:szCs w:val="24"/>
+        </w:rPr>
+        <w:t>Korisnik</w:t>
+      </w:r>
+      <w:proofErr w:type="spellEnd"/>
+      <w:r>
+        <w:rPr>
+          <w:rStyle w:val="Heading2Char"/>
+          <w:color w:val="000000" w:themeColor="dark1"/>
+          <w:sz w:val="24"/>
+          <w:szCs w:val="24"/>
+        </w:rPr>
+        <w:t xml:space="preserve"> </w:t>
+      </w:r>
+      <w:proofErr w:type="spellStart"/>
+      <w:r>
+        <w:rPr>
+          <w:rStyle w:val="Heading2Char"/>
+          <w:color w:val="000000" w:themeColor="dark1"/>
+          <w:sz w:val="24"/>
+          <w:szCs w:val="24"/>
+        </w:rPr>
+        <w:t>pritiska</w:t>
+      </w:r>
+      <w:proofErr w:type="spellEnd"/>
+      <w:r>
+        <w:rPr>
+          <w:rStyle w:val="Heading2Char"/>
+          <w:color w:val="000000" w:themeColor="dark1"/>
+          <w:sz w:val="24"/>
+          <w:szCs w:val="24"/>
+        </w:rPr>
+        <w:t xml:space="preserve"> </w:t>
+      </w:r>
+      <w:proofErr w:type="spellStart"/>
+      <w:r>
+        <w:rPr>
+          <w:rStyle w:val="Heading2Char"/>
+          <w:color w:val="000000" w:themeColor="dark1"/>
+          <w:sz w:val="24"/>
+          <w:szCs w:val="24"/>
+        </w:rPr>
+        <w:t>dugme</w:t>
+      </w:r>
+      <w:proofErr w:type="spellEnd"/>
+      <w:r>
+        <w:rPr>
+          <w:rStyle w:val="Heading2Char"/>
+          <w:color w:val="000000" w:themeColor="dark1"/>
+          <w:sz w:val="24"/>
+          <w:szCs w:val="24"/>
+        </w:rPr>
+        <w:t xml:space="preserve"> za </w:t>
+      </w:r>
+      <w:proofErr w:type="spellStart"/>
+      <w:r>
+        <w:rPr>
+          <w:rStyle w:val="Heading2Char"/>
+          <w:color w:val="000000" w:themeColor="dark1"/>
+          <w:sz w:val="24"/>
+          <w:szCs w:val="24"/>
+        </w:rPr>
+        <w:t>pretragu</w:t>
+      </w:r>
+      <w:proofErr w:type="spellEnd"/>
+      <w:r>
+        <w:rPr>
+          <w:rStyle w:val="Heading2Char"/>
+          <w:color w:val="000000" w:themeColor="dark1"/>
+          <w:sz w:val="24"/>
+          <w:szCs w:val="24"/>
+        </w:rPr>
+        <w:t>.</w:t>
       </w:r>
       <w:r>
         <w:rPr>
@@ -3068,7 +4596,204 @@
           <w:szCs w:val="24"/>
         </w:rPr>
         <w:br/>
-        <w:t>4. Iz baze podataka se uzimaju komponente koje zadovoljavaju navedene kriterijume.</w:t>
+      </w:r>
+      <w:r>
+        <w:rPr>
+          <w:rStyle w:val="Heading2Char"/>
+          <w:color w:val="000000" w:themeColor="dark1"/>
+          <w:sz w:val="24"/>
+          <w:szCs w:val="24"/>
+        </w:rPr>
+        <w:t>3</w:t>
+      </w:r>
+      <w:r>
+        <w:rPr>
+          <w:rStyle w:val="Heading2Char"/>
+          <w:color w:val="000000" w:themeColor="dark1"/>
+          <w:sz w:val="24"/>
+          <w:szCs w:val="24"/>
+        </w:rPr>
+        <w:t xml:space="preserve">. </w:t>
+      </w:r>
+      <w:proofErr w:type="spellStart"/>
+      <w:r>
+        <w:rPr>
+          <w:rStyle w:val="Heading2Char"/>
+          <w:color w:val="000000" w:themeColor="dark1"/>
+          <w:sz w:val="24"/>
+          <w:szCs w:val="24"/>
+        </w:rPr>
+        <w:t>Iz</w:t>
+      </w:r>
+      <w:proofErr w:type="spellEnd"/>
+      <w:r>
+        <w:rPr>
+          <w:rStyle w:val="Heading2Char"/>
+          <w:color w:val="000000" w:themeColor="dark1"/>
+          <w:sz w:val="24"/>
+          <w:szCs w:val="24"/>
+        </w:rPr>
+        <w:t xml:space="preserve"> </w:t>
+      </w:r>
+      <w:proofErr w:type="spellStart"/>
+      <w:r>
+        <w:rPr>
+          <w:rStyle w:val="Heading2Char"/>
+          <w:color w:val="000000" w:themeColor="dark1"/>
+          <w:sz w:val="24"/>
+          <w:szCs w:val="24"/>
+        </w:rPr>
+        <w:t>baze</w:t>
+      </w:r>
+      <w:proofErr w:type="spellEnd"/>
+      <w:r>
+        <w:rPr>
+          <w:rStyle w:val="Heading2Char"/>
+          <w:color w:val="000000" w:themeColor="dark1"/>
+          <w:sz w:val="24"/>
+          <w:szCs w:val="24"/>
+        </w:rPr>
+        <w:t xml:space="preserve"> </w:t>
+      </w:r>
+      <w:proofErr w:type="spellStart"/>
+      <w:r>
+        <w:rPr>
+          <w:rStyle w:val="Heading2Char"/>
+          <w:color w:val="000000" w:themeColor="dark1"/>
+          <w:sz w:val="24"/>
+          <w:szCs w:val="24"/>
+        </w:rPr>
+        <w:t>podataka</w:t>
+      </w:r>
+      <w:proofErr w:type="spellEnd"/>
+      <w:r>
+        <w:rPr>
+          <w:rStyle w:val="Heading2Char"/>
+          <w:color w:val="000000" w:themeColor="dark1"/>
+          <w:sz w:val="24"/>
+          <w:szCs w:val="24"/>
+        </w:rPr>
+        <w:t xml:space="preserve"> se </w:t>
+      </w:r>
+      <w:proofErr w:type="spellStart"/>
+      <w:r>
+        <w:rPr>
+          <w:rStyle w:val="Heading2Char"/>
+          <w:color w:val="000000" w:themeColor="dark1"/>
+          <w:sz w:val="24"/>
+          <w:szCs w:val="24"/>
+        </w:rPr>
+        <w:t>uzimaju</w:t>
+      </w:r>
+      <w:proofErr w:type="spellEnd"/>
+      <w:r>
+        <w:rPr>
+          <w:rStyle w:val="Heading2Char"/>
+          <w:color w:val="000000" w:themeColor="dark1"/>
+          <w:sz w:val="24"/>
+          <w:szCs w:val="24"/>
+        </w:rPr>
+        <w:t xml:space="preserve"> </w:t>
+      </w:r>
+      <w:proofErr w:type="spellStart"/>
+      <w:r>
+        <w:rPr>
+          <w:rStyle w:val="Heading2Char"/>
+          <w:color w:val="000000" w:themeColor="dark1"/>
+          <w:sz w:val="24"/>
+          <w:szCs w:val="24"/>
+        </w:rPr>
+        <w:t>komponente</w:t>
+      </w:r>
+      <w:proofErr w:type="spellEnd"/>
+      <w:r>
+        <w:rPr>
+          <w:rStyle w:val="Heading2Char"/>
+          <w:color w:val="000000" w:themeColor="dark1"/>
+          <w:sz w:val="24"/>
+          <w:szCs w:val="24"/>
+        </w:rPr>
+        <w:t xml:space="preserve"> </w:t>
+      </w:r>
+      <w:proofErr w:type="spellStart"/>
+      <w:r>
+        <w:rPr>
+          <w:rStyle w:val="Heading2Char"/>
+          <w:color w:val="000000" w:themeColor="dark1"/>
+          <w:sz w:val="24"/>
+          <w:szCs w:val="24"/>
+        </w:rPr>
+        <w:t>koje</w:t>
+      </w:r>
+      <w:proofErr w:type="spellEnd"/>
+      <w:r>
+        <w:rPr>
+          <w:rStyle w:val="Heading2Char"/>
+          <w:color w:val="000000" w:themeColor="dark1"/>
+          <w:sz w:val="24"/>
+          <w:szCs w:val="24"/>
+        </w:rPr>
+        <w:t xml:space="preserve"> </w:t>
+      </w:r>
+      <w:proofErr w:type="spellStart"/>
+      <w:r>
+        <w:rPr>
+          <w:rStyle w:val="Heading2Char"/>
+          <w:color w:val="000000" w:themeColor="dark1"/>
+          <w:sz w:val="24"/>
+          <w:szCs w:val="24"/>
+        </w:rPr>
+        <w:t>zadovoljavaju</w:t>
+      </w:r>
+      <w:proofErr w:type="spellEnd"/>
+      <w:r>
+        <w:rPr>
+          <w:rStyle w:val="Heading2Char"/>
+          <w:color w:val="000000" w:themeColor="dark1"/>
+          <w:sz w:val="24"/>
+          <w:szCs w:val="24"/>
+        </w:rPr>
+        <w:t xml:space="preserve"> </w:t>
+      </w:r>
+      <w:proofErr w:type="spellStart"/>
+      <w:r>
+        <w:rPr>
+          <w:rStyle w:val="Heading2Char"/>
+          <w:color w:val="000000" w:themeColor="dark1"/>
+          <w:sz w:val="24"/>
+          <w:szCs w:val="24"/>
+        </w:rPr>
+        <w:t>navedene</w:t>
+      </w:r>
+      <w:proofErr w:type="spellEnd"/>
+      <w:r>
+        <w:rPr>
+          <w:rStyle w:val="Heading2Char"/>
+          <w:color w:val="000000" w:themeColor="dark1"/>
+          <w:sz w:val="24"/>
+          <w:szCs w:val="24"/>
+        </w:rPr>
+        <w:t xml:space="preserve"> </w:t>
+      </w:r>
+      <w:proofErr w:type="spellStart"/>
+      <w:r>
+        <w:rPr>
+          <w:rStyle w:val="Heading2Char"/>
+          <w:color w:val="000000" w:themeColor="dark1"/>
+          <w:sz w:val="24"/>
+          <w:szCs w:val="24"/>
+        </w:rPr>
+        <w:t>kriterijume</w:t>
+      </w:r>
+      <w:proofErr w:type="spellEnd"/>
+      <w:r>
+        <w:rPr>
+          <w:rStyle w:val="Heading2Char"/>
+          <w:color w:val="000000" w:themeColor="dark1"/>
+          <w:sz w:val="24"/>
+          <w:szCs w:val="24"/>
+        </w:rPr>
+        <w:t>.</w:t>
       </w:r>
       <w:r>
         <w:rPr>
@@ -3078,7 +4803,204 @@
           <w:szCs w:val="24"/>
         </w:rPr>
         <w:br/>
-        <w:t>5. Korisniku se na ekranu prikazuju komponente koje ispunjavaju kriterijume filtriranja.</w:t>
+      </w:r>
+      <w:r>
+        <w:rPr>
+          <w:rStyle w:val="Heading2Char"/>
+          <w:color w:val="000000" w:themeColor="dark1"/>
+          <w:sz w:val="24"/>
+          <w:szCs w:val="24"/>
+        </w:rPr>
+        <w:t>4</w:t>
+      </w:r>
+      <w:r>
+        <w:rPr>
+          <w:rStyle w:val="Heading2Char"/>
+          <w:color w:val="000000" w:themeColor="dark1"/>
+          <w:sz w:val="24"/>
+          <w:szCs w:val="24"/>
+        </w:rPr>
+        <w:t xml:space="preserve">. </w:t>
+      </w:r>
+      <w:proofErr w:type="spellStart"/>
+      <w:r>
+        <w:rPr>
+          <w:rStyle w:val="Heading2Char"/>
+          <w:color w:val="000000" w:themeColor="dark1"/>
+          <w:sz w:val="24"/>
+          <w:szCs w:val="24"/>
+        </w:rPr>
+        <w:t>Korisniku</w:t>
+      </w:r>
+      <w:proofErr w:type="spellEnd"/>
+      <w:r>
+        <w:rPr>
+          <w:rStyle w:val="Heading2Char"/>
+          <w:color w:val="000000" w:themeColor="dark1"/>
+          <w:sz w:val="24"/>
+          <w:szCs w:val="24"/>
+        </w:rPr>
+        <w:t xml:space="preserve"> se </w:t>
+      </w:r>
+      <w:proofErr w:type="spellStart"/>
+      <w:r>
+        <w:rPr>
+          <w:rStyle w:val="Heading2Char"/>
+          <w:color w:val="000000" w:themeColor="dark1"/>
+          <w:sz w:val="24"/>
+          <w:szCs w:val="24"/>
+        </w:rPr>
+        <w:t>na</w:t>
+      </w:r>
+      <w:proofErr w:type="spellEnd"/>
+      <w:r>
+        <w:rPr>
+          <w:rStyle w:val="Heading2Char"/>
+          <w:color w:val="000000" w:themeColor="dark1"/>
+          <w:sz w:val="24"/>
+          <w:szCs w:val="24"/>
+        </w:rPr>
+        <w:t xml:space="preserve"> </w:t>
+      </w:r>
+      <w:proofErr w:type="spellStart"/>
+      <w:r>
+        <w:rPr>
+          <w:rStyle w:val="Heading2Char"/>
+          <w:color w:val="000000" w:themeColor="dark1"/>
+          <w:sz w:val="24"/>
+          <w:szCs w:val="24"/>
+        </w:rPr>
+        <w:t>ekranu</w:t>
+      </w:r>
+      <w:proofErr w:type="spellEnd"/>
+      <w:r>
+        <w:rPr>
+          <w:rStyle w:val="Heading2Char"/>
+          <w:color w:val="000000" w:themeColor="dark1"/>
+          <w:sz w:val="24"/>
+          <w:szCs w:val="24"/>
+        </w:rPr>
+        <w:t xml:space="preserve"> </w:t>
+      </w:r>
+      <w:proofErr w:type="spellStart"/>
+      <w:r>
+        <w:rPr>
+          <w:rStyle w:val="Heading2Char"/>
+          <w:color w:val="000000" w:themeColor="dark1"/>
+          <w:sz w:val="24"/>
+          <w:szCs w:val="24"/>
+        </w:rPr>
+        <w:t>prikazuju</w:t>
+      </w:r>
+      <w:proofErr w:type="spellEnd"/>
+      <w:r>
+        <w:rPr>
+          <w:rStyle w:val="Heading2Char"/>
+          <w:color w:val="000000" w:themeColor="dark1"/>
+          <w:sz w:val="24"/>
+          <w:szCs w:val="24"/>
+        </w:rPr>
+        <w:t xml:space="preserve"> </w:t>
+      </w:r>
+      <w:proofErr w:type="spellStart"/>
+      <w:r>
+        <w:rPr>
+          <w:rStyle w:val="Heading2Char"/>
+          <w:color w:val="000000" w:themeColor="dark1"/>
+          <w:sz w:val="24"/>
+          <w:szCs w:val="24"/>
+        </w:rPr>
+        <w:t>komponente</w:t>
+      </w:r>
+      <w:proofErr w:type="spellEnd"/>
+      <w:r>
+        <w:rPr>
+          <w:rStyle w:val="Heading2Char"/>
+          <w:color w:val="000000" w:themeColor="dark1"/>
+          <w:sz w:val="24"/>
+          <w:szCs w:val="24"/>
+        </w:rPr>
+        <w:t xml:space="preserve"> </w:t>
+      </w:r>
+      <w:proofErr w:type="spellStart"/>
+      <w:r>
+        <w:rPr>
+          <w:rStyle w:val="Heading2Char"/>
+          <w:color w:val="000000" w:themeColor="dark1"/>
+          <w:sz w:val="24"/>
+          <w:szCs w:val="24"/>
+        </w:rPr>
+        <w:t>koje</w:t>
+      </w:r>
+      <w:proofErr w:type="spellEnd"/>
+      <w:r>
+        <w:rPr>
+          <w:rStyle w:val="Heading2Char"/>
+          <w:color w:val="000000" w:themeColor="dark1"/>
+          <w:sz w:val="24"/>
+          <w:szCs w:val="24"/>
+        </w:rPr>
+        <w:t xml:space="preserve"> </w:t>
+      </w:r>
+      <w:proofErr w:type="spellStart"/>
+      <w:r>
+        <w:rPr>
+          <w:rStyle w:val="Heading2Char"/>
+          <w:color w:val="000000" w:themeColor="dark1"/>
+          <w:sz w:val="24"/>
+          <w:szCs w:val="24"/>
+        </w:rPr>
+        <w:t>ispunjavaju</w:t>
+      </w:r>
+      <w:proofErr w:type="spellEnd"/>
+      <w:r>
+        <w:rPr>
+          <w:rStyle w:val="Heading2Char"/>
+          <w:color w:val="000000" w:themeColor="dark1"/>
+          <w:sz w:val="24"/>
+          <w:szCs w:val="24"/>
+        </w:rPr>
+        <w:t xml:space="preserve"> </w:t>
+      </w:r>
+      <w:proofErr w:type="spellStart"/>
+      <w:r>
+        <w:rPr>
+          <w:rStyle w:val="Heading2Char"/>
+          <w:color w:val="000000" w:themeColor="dark1"/>
+          <w:sz w:val="24"/>
+          <w:szCs w:val="24"/>
+        </w:rPr>
+        <w:t>kriterijume</w:t>
+      </w:r>
+      <w:proofErr w:type="spellEnd"/>
+      <w:r>
+        <w:rPr>
+          <w:rStyle w:val="Heading2Char"/>
+          <w:color w:val="000000" w:themeColor="dark1"/>
+          <w:sz w:val="24"/>
+          <w:szCs w:val="24"/>
+        </w:rPr>
+        <w:t xml:space="preserve"> </w:t>
+      </w:r>
+      <w:proofErr w:type="spellStart"/>
+      <w:r>
+        <w:rPr>
+          <w:rStyle w:val="Heading2Char"/>
+          <w:color w:val="000000" w:themeColor="dark1"/>
+          <w:sz w:val="24"/>
+          <w:szCs w:val="24"/>
+        </w:rPr>
+        <w:t>filtriranja</w:t>
+      </w:r>
+      <w:proofErr w:type="spellEnd"/>
+      <w:r>
+        <w:rPr>
+          <w:rStyle w:val="Heading2Char"/>
+          <w:color w:val="000000" w:themeColor="dark1"/>
+          <w:sz w:val="24"/>
+          <w:szCs w:val="24"/>
+        </w:rPr>
+        <w:t>.</w:t>
       </w:r>
       <w:bookmarkEnd w:id="20"/>
     </w:p>
@@ -3114,6 +5036,7 @@
         </w:rPr>
         <w:tab/>
       </w:r>
+      <w:proofErr w:type="spellStart"/>
       <w:r>
         <w:rPr>
           <w:rStyle w:val="Heading2Char"/>
@@ -3124,9 +5047,114 @@
           <w:szCs w:val="24"/>
           <w:u w:val="single"/>
         </w:rPr>
-        <w:t>Korisnik se odlučuje na sortiranje komponenti</w:t>
+        <w:t>Korisnik</w:t>
+      </w:r>
+      <w:proofErr w:type="spellEnd"/>
+      <w:r>
+        <w:rPr>
+          <w:rStyle w:val="Heading2Char"/>
+          <w:b/>
+          <w:bCs/>
+          <w:color w:val="auto"/>
+          <w:sz w:val="24"/>
+          <w:szCs w:val="24"/>
+          <w:u w:val="single"/>
+        </w:rPr>
+        <w:t xml:space="preserve"> se </w:t>
+      </w:r>
+      <w:proofErr w:type="spellStart"/>
+      <w:r>
+        <w:rPr>
+          <w:rStyle w:val="Heading2Char"/>
+          <w:b/>
+          <w:bCs/>
+          <w:color w:val="auto"/>
+          <w:sz w:val="24"/>
+          <w:szCs w:val="24"/>
+          <w:u w:val="single"/>
+        </w:rPr>
+        <w:t>odlučuje</w:t>
+      </w:r>
+      <w:proofErr w:type="spellEnd"/>
+      <w:r>
+        <w:rPr>
+          <w:rStyle w:val="Heading2Char"/>
+          <w:b/>
+          <w:bCs/>
+          <w:color w:val="auto"/>
+          <w:sz w:val="24"/>
+          <w:szCs w:val="24"/>
+          <w:u w:val="single"/>
+        </w:rPr>
+        <w:t xml:space="preserve"> </w:t>
+      </w:r>
+      <w:proofErr w:type="spellStart"/>
+      <w:r>
+        <w:rPr>
+          <w:rStyle w:val="Heading2Char"/>
+          <w:b/>
+          <w:bCs/>
+          <w:color w:val="auto"/>
+          <w:sz w:val="24"/>
+          <w:szCs w:val="24"/>
+          <w:u w:val="single"/>
+        </w:rPr>
+        <w:t>na</w:t>
+      </w:r>
+      <w:proofErr w:type="spellEnd"/>
+      <w:r>
+        <w:rPr>
+          <w:rStyle w:val="Heading2Char"/>
+          <w:b/>
+          <w:bCs/>
+          <w:color w:val="auto"/>
+          <w:sz w:val="24"/>
+          <w:szCs w:val="24"/>
+          <w:u w:val="single"/>
+        </w:rPr>
+        <w:t xml:space="preserve"> </w:t>
+      </w:r>
+      <w:proofErr w:type="spellStart"/>
+      <w:r>
+        <w:rPr>
+          <w:rStyle w:val="Heading2Char"/>
+          <w:b/>
+          <w:bCs/>
+          <w:color w:val="auto"/>
+          <w:sz w:val="24"/>
+          <w:szCs w:val="24"/>
+          <w:u w:val="single"/>
+        </w:rPr>
+        <w:t>sortiranje</w:t>
+      </w:r>
+      <w:proofErr w:type="spellEnd"/>
+      <w:r>
+        <w:rPr>
+          <w:rStyle w:val="Heading2Char"/>
+          <w:b/>
+          <w:bCs/>
+          <w:color w:val="auto"/>
+          <w:sz w:val="24"/>
+          <w:szCs w:val="24"/>
+          <w:u w:val="single"/>
+        </w:rPr>
+        <w:t xml:space="preserve"> </w:t>
+      </w:r>
+      <w:proofErr w:type="spellStart"/>
+      <w:r>
+        <w:rPr>
+          <w:rStyle w:val="Heading2Char"/>
+          <w:b/>
+          <w:bCs/>
+          <w:color w:val="auto"/>
+          <w:sz w:val="24"/>
+          <w:szCs w:val="24"/>
+          <w:u w:val="single"/>
+        </w:rPr>
+        <w:t>komponenti</w:t>
       </w:r>
       <w:bookmarkEnd w:id="21"/>
+      <w:proofErr w:type="spellEnd"/>
     </w:p>
     <w:p>
       <w:pPr>
@@ -3301,10 +5329,40 @@
           <w:color w:val="auto"/>
         </w:rPr>
         <w:tab/>
-        <w:t>Posebni zahtevi</w:t>
+      </w:r>
+      <w:proofErr w:type="spellStart"/>
+      <w:r>
+        <w:rPr>
+          <w:rStyle w:val="Heading2Char"/>
+          <w:b/>
+          <w:bCs/>
+          <w:color w:val="auto"/>
+        </w:rPr>
+        <w:t>Posebni</w:t>
+      </w:r>
+      <w:proofErr w:type="spellEnd"/>
+      <w:r>
+        <w:rPr>
+          <w:rStyle w:val="Heading2Char"/>
+          <w:b/>
+          <w:bCs/>
+          <w:color w:val="auto"/>
+        </w:rPr>
+        <w:t xml:space="preserve"> </w:t>
+      </w:r>
+      <w:proofErr w:type="spellStart"/>
+      <w:r>
+        <w:rPr>
+          <w:rStyle w:val="Heading2Char"/>
+          <w:b/>
+          <w:bCs/>
+          <w:color w:val="auto"/>
+        </w:rPr>
+        <w:t>zahtevi</w:t>
       </w:r>
       <w:bookmarkEnd w:id="24"/>
       <w:bookmarkEnd w:id="25"/>
+      <w:proofErr w:type="spellEnd"/>
       <w:r>
         <w:rPr>
           <w:rStyle w:val="Heading2Char"/>
@@ -3349,10 +5407,20 @@
           <w:color w:val="auto"/>
         </w:rPr>
         <w:tab/>
+      </w:r>
+      <w:proofErr w:type="spellStart"/>
+      <w:r>
+        <w:rPr>
+          <w:rStyle w:val="Heading2Char"/>
+          <w:b/>
+          <w:bCs/>
+          <w:color w:val="auto"/>
+        </w:rPr>
         <w:t>Preduslovi</w:t>
       </w:r>
       <w:bookmarkEnd w:id="26"/>
       <w:bookmarkEnd w:id="27"/>
+      <w:proofErr w:type="spellEnd"/>
       <w:r>
         <w:rPr>
           <w:rStyle w:val="Heading2Char"/>
@@ -3397,9 +5465,19 @@
           <w:color w:val="auto"/>
         </w:rPr>
         <w:tab/>
+      </w:r>
+      <w:proofErr w:type="spellStart"/>
+      <w:r>
+        <w:rPr>
+          <w:rStyle w:val="Heading2Char"/>
+          <w:b/>
+          <w:bCs/>
+          <w:color w:val="auto"/>
+        </w:rPr>
         <w:t>Posledice</w:t>
       </w:r>
       <w:bookmarkEnd w:id="28"/>
+      <w:proofErr w:type="spellEnd"/>
       <w:r>
         <w:rPr>
           <w:b/>

</xml_diff>